<commit_message>
Regenerate reports with TECMILENIO style matching Act11_HW9 reference
</commit_message>
<xml_diff>
--- a/Reporte_Activity12.docx
+++ b/Reporte_Activity12.docx
@@ -4,129 +4,276 @@
   <w:body>
     <w:p>
       <w:pPr>
-        <w:pStyle w:val="Title"/>
+        <w:spacing w:before="480" w:after="40"/>
         <w:jc w:val="center"/>
       </w:pPr>
       <w:r>
         <w:rPr>
-          <w:color w:val="C0392B"/>
+          <w:rFonts w:ascii="Calibri" w:hAnsi="Calibri"/>
+          <w:b/>
+          <w:i w:val="0"/>
+          <w:color w:val="1A237E"/>
+          <w:sz w:val="56"/>
         </w:rPr>
-        <w:t>Activity 12 – ChuckJokesVue</w:t>
+        <w:t>TECMILENIO</w:t>
       </w:r>
     </w:p>
     <w:p>
       <w:pPr>
+        <w:spacing w:before="0" w:after="40"/>
         <w:jc w:val="center"/>
       </w:pPr>
       <w:r>
-        <w:t>Date: April 20, 2026</w:t>
+        <w:rPr>
+          <w:rFonts w:ascii="Calibri" w:hAnsi="Calibri"/>
+          <w:b w:val="0"/>
+          <w:i w:val="0"/>
+          <w:color w:val="424242"/>
+          <w:sz w:val="26"/>
+        </w:rPr>
+        <w:t>Universidad Tecmilenio</w:t>
       </w:r>
     </w:p>
     <w:p>
       <w:pPr>
+        <w:spacing w:before="0" w:after="200"/>
         <w:jc w:val="center"/>
       </w:pPr>
       <w:r>
-        <w:t>Course: JavaScript – Vue Framework</w:t>
+        <w:rPr>
+          <w:rFonts w:ascii="Calibri" w:hAnsi="Calibri"/>
+          <w:b/>
+          <w:i w:val="0"/>
+          <w:color w:val="424242"/>
+          <w:sz w:val="22"/>
+        </w:rPr>
+        <w:t>DESARROLLO DE APLICACIONES WEB</w:t>
       </w:r>
     </w:p>
     <w:p>
       <w:pPr>
+        <w:spacing w:before="80" w:after="80"/>
         <w:pBdr>
-          <w:bottom w:val="single" w:sz="6" w:space="1" w:color="C0392B"/>
+          <w:bottom w:val="single" w:sz="6" w:space="1" w:color="1A237E"/>
         </w:pBdr>
       </w:pPr>
     </w:p>
     <w:p>
       <w:pPr>
-        <w:pStyle w:val="Heading1"/>
+        <w:spacing w:before="160" w:after="80"/>
+        <w:jc w:val="center"/>
       </w:pPr>
       <w:r>
-        <w:t>Description</w:t>
+        <w:rPr>
+          <w:rFonts w:ascii="Calibri" w:hAnsi="Calibri"/>
+          <w:b w:val="0"/>
+          <w:i/>
+          <w:color w:val="646464"/>
+          <w:sz w:val="26"/>
+        </w:rPr>
+        <w:t>Reporte de Actividades</w:t>
+      </w:r>
+    </w:p>
+    <w:p>
+      <w:pPr>
+        <w:spacing w:before="0" w:after="80"/>
+        <w:jc w:val="center"/>
+      </w:pPr>
+      <w:r>
+        <w:rPr>
+          <w:rFonts w:ascii="Calibri" w:hAnsi="Calibri"/>
+          <w:b/>
+          <w:i w:val="0"/>
+          <w:color w:val="1A237E"/>
+          <w:sz w:val="32"/>
+        </w:rPr>
+        <w:t>Activity 12  ·  ChuckJokesVue</w:t>
+      </w:r>
+    </w:p>
+    <w:p>
+      <w:pPr>
+        <w:spacing w:before="0" w:after="320"/>
+        <w:jc w:val="center"/>
+      </w:pPr>
+      <w:r>
+        <w:rPr>
+          <w:rFonts w:ascii="Calibri" w:hAnsi="Calibri"/>
+          <w:b w:val="0"/>
+          <w:i/>
+          <w:color w:val="424242"/>
+          <w:sz w:val="22"/>
+        </w:rPr>
+        <w:t>Aplicación Vue.js con instancia, v-for y hoja de estilos</w:t>
+      </w:r>
+    </w:p>
+    <w:p>
+      <w:pPr>
+        <w:spacing w:before="80" w:after="80"/>
+        <w:pBdr>
+          <w:bottom w:val="single" w:sz="6" w:space="1" w:color="BDBDBD"/>
+        </w:pBdr>
+      </w:pPr>
+    </w:p>
+    <w:p>
+      <w:pPr>
+        <w:spacing w:before="240" w:after="40"/>
+        <w:jc w:val="center"/>
+      </w:pPr>
+      <w:r>
+        <w:rPr>
+          <w:rFonts w:ascii="Calibri" w:hAnsi="Calibri"/>
+          <w:b w:val="0"/>
+          <w:i/>
+          <w:color w:val="787878"/>
+          <w:sz w:val="20"/>
+        </w:rPr>
+        <w:t>Alumno</w:t>
+        <w:br/>
+      </w:r>
+      <w:r>
+        <w:rPr>
+          <w:rFonts w:ascii="Calibri" w:hAnsi="Calibri"/>
+          <w:b/>
+          <w:i w:val="0"/>
+          <w:color w:val="1A237E"/>
+          <w:sz w:val="26"/>
+        </w:rPr>
+        <w:t>Andrew Tran</w:t>
+      </w:r>
+    </w:p>
+    <w:p>
+      <w:pPr>
+        <w:spacing w:before="80" w:after="400"/>
+        <w:jc w:val="center"/>
+      </w:pPr>
+      <w:r>
+        <w:rPr>
+          <w:rFonts w:ascii="Calibri" w:hAnsi="Calibri"/>
+          <w:b w:val="0"/>
+          <w:i w:val="0"/>
+          <w:color w:val="787878"/>
+          <w:sz w:val="20"/>
+        </w:rPr>
+        <w:t>20 de abril de 2026</w:t>
       </w:r>
     </w:p>
     <w:p>
       <w:r>
-        <w:t>In this activity, a Vue.js web application was created to display a list of Chuck Norris jokes. The data is stored as an array of objects inside the Vue instance and rendered dynamically using the v-for directive. A custom stylesheet gives the page a dark, minimalist aesthetic.</w:t>
+        <w:br w:type="page"/>
       </w:r>
     </w:p>
     <w:p>
       <w:pPr>
-        <w:pStyle w:val="Heading1"/>
+        <w:spacing w:before="280" w:after="80"/>
+        <w:jc w:val="left"/>
+        <w:pBdr>
+          <w:bottom w:val="single" w:sz="4" w:space="1" w:color="1A237E"/>
+        </w:pBdr>
       </w:pPr>
       <w:r>
-        <w:t>Objective</w:t>
-      </w:r>
-    </w:p>
-    <w:p>
-      <w:r>
-        <w:t>Work with the JavaScript Vue framework to create a primary view that iterates and displays data.</w:t>
+        <w:rPr>
+          <w:rFonts w:ascii="Calibri" w:hAnsi="Calibri"/>
+          <w:b/>
+          <w:i w:val="0"/>
+          <w:color w:val="1A237E"/>
+          <w:sz w:val="30"/>
+        </w:rPr>
+        <w:t>Introducción</w:t>
       </w:r>
     </w:p>
     <w:p>
       <w:pPr>
-        <w:pStyle w:val="Heading1"/>
+        <w:spacing w:before="0" w:after="120"/>
+        <w:jc w:val="left"/>
       </w:pPr>
       <w:r>
-        <w:t>Requirements Met</w:t>
+        <w:rPr>
+          <w:rFonts w:ascii="Calibri" w:hAnsi="Calibri"/>
+          <w:b w:val="0"/>
+          <w:i w:val="0"/>
+          <w:color w:val="424242"/>
+          <w:sz w:val="21"/>
+        </w:rPr>
+        <w:t>La actividad consistía en crear una aplicación web con el framework Vue.js que desplegara una lista de frases célebres de Chuck Norris. La idea central era aprender el funcionamiento básico de Vue: cómo se declara una instancia, cómo se almacenan datos reactivos y cómo se itera sobre ellos en el template usando la directiva v-for.</w:t>
       </w:r>
     </w:p>
     <w:p>
       <w:pPr>
-        <w:pStyle w:val="ListBullet"/>
+        <w:spacing w:before="0" w:after="120"/>
+        <w:jc w:val="left"/>
       </w:pPr>
       <w:r>
-        <w:t>Vue 3 instance created via CDN with the chuck data array.</w:t>
+        <w:rPr>
+          <w:rFonts w:ascii="Calibri" w:hAnsi="Calibri"/>
+          <w:b w:val="0"/>
+          <w:i w:val="0"/>
+          <w:color w:val="424242"/>
+          <w:sz w:val="21"/>
+        </w:rPr>
+        <w:t>Lo que me resultó interesante de Vue desde el principio es que separa muy claramente los datos de la presentación. No hay que manipular el DOM directamente; simplemente declaras qué datos quieres mostrar y Vue se encarga de renderizarlos y mantenerlos actualizados automáticamente.</w:t>
       </w:r>
     </w:p>
     <w:p>
       <w:pPr>
-        <w:pStyle w:val="ListBullet"/>
+        <w:spacing w:before="280" w:after="80"/>
+        <w:jc w:val="left"/>
+        <w:pBdr>
+          <w:bottom w:val="single" w:sz="4" w:space="1" w:color="1A237E"/>
+        </w:pBdr>
       </w:pPr>
       <w:r>
-        <w:t>Five Chuck Norris jokes displayed as a list using the v-for directive.</w:t>
+        <w:rPr>
+          <w:rFonts w:ascii="Calibri" w:hAnsi="Calibri"/>
+          <w:b/>
+          <w:i w:val="0"/>
+          <w:color w:val="1A237E"/>
+          <w:sz w:val="30"/>
+        </w:rPr>
+        <w:t>Proceso de desarrollo</w:t>
       </w:r>
     </w:p>
     <w:p>
       <w:pPr>
-        <w:pStyle w:val="ListBullet"/>
+        <w:spacing w:before="200" w:after="60"/>
+        <w:jc w:val="left"/>
       </w:pPr>
       <w:r>
-        <w:t>Custom dark-theme CSS stylesheet (css/style.css) with gradient header and card styles.</w:t>
+        <w:rPr>
+          <w:rFonts w:ascii="Calibri" w:hAnsi="Calibri"/>
+          <w:b/>
+          <w:i w:val="0"/>
+          <w:color w:val="00897B"/>
+          <w:sz w:val="24"/>
+        </w:rPr>
+        <w:t>Instancia de Vue y estructura de datos</w:t>
       </w:r>
     </w:p>
     <w:p>
       <w:pPr>
-        <w:pStyle w:val="ListBullet"/>
+        <w:spacing w:before="0" w:after="120"/>
+        <w:jc w:val="left"/>
       </w:pPr>
       <w:r>
-        <w:t>Git project created and uploaded to GitHub as "ChuckJokesVue".</w:t>
+        <w:rPr>
+          <w:rFonts w:ascii="Calibri" w:hAnsi="Calibri"/>
+          <w:b w:val="0"/>
+          <w:i w:val="0"/>
+          <w:color w:val="424242"/>
+          <w:sz w:val="21"/>
+        </w:rPr>
+        <w:t>Lo primero fue crear la instancia de Vue apuntando al elemento con id='app'. Dentro de data() se declaró el arreglo chuck con cinco objetos, cada uno con la propiedad value que contiene el texto de la frase.</w:t>
       </w:r>
     </w:p>
     <w:p>
       <w:pPr>
-        <w:pStyle w:val="ListBullet"/>
-      </w:pPr>
-      <w:r>
-        <w:t>README.md edited with project description.</w:t>
-      </w:r>
-    </w:p>
-    <w:p>
-      <w:pPr>
-        <w:pStyle w:val="Heading1"/>
-      </w:pPr>
-      <w:r>
-        <w:t>Data Structure Used</w:t>
-      </w:r>
-    </w:p>
-    <w:p>
-      <w:pPr>
-        <w:pStyle w:val="NoSpacing"/>
+        <w:spacing w:after="120"/>
+        <w:ind w:left="432"/>
+        <w:shd w:val="clear" w:color="auto" w:fill="F5F5F5"/>
       </w:pPr>
       <w:r>
         <w:rPr>
           <w:rFonts w:ascii="Courier New" w:hAnsi="Courier New"/>
-          <w:color w:val="505050"/>
+          <w:color w:val="3C3C3C"/>
           <w:sz w:val="18"/>
         </w:rPr>
         <w:t>chuck: [</w:t>
@@ -135,7 +282,7 @@
         <w:br/>
         <w:t xml:space="preserve">  { "value": "The chief export of Chuck Norris is pain." },</w:t>
         <w:br/>
-        <w:t xml:space="preserve">  { "value": "Chuck Norris doesn't read books. He stares them down..." },</w:t>
+        <w:t xml:space="preserve">  { "value": "Chuck Norris doesn't read books..." },</w:t>
         <w:br/>
         <w:t xml:space="preserve">  { "value": "Time waits for no man. Unless that man is Chuck Norris." },</w:t>
         <w:br/>
@@ -146,83 +293,265 @@
     </w:p>
     <w:p>
       <w:pPr>
-        <w:pStyle w:val="Heading1"/>
+        <w:spacing w:before="200" w:after="60"/>
+        <w:jc w:val="left"/>
       </w:pPr>
       <w:r>
-        <w:t>Key Vue Code (v-for)</w:t>
+        <w:rPr>
+          <w:rFonts w:ascii="Calibri" w:hAnsi="Calibri"/>
+          <w:b/>
+          <w:i w:val="0"/>
+          <w:color w:val="00897B"/>
+          <w:sz w:val="24"/>
+        </w:rPr>
+        <w:t>Directiva v-for</w:t>
       </w:r>
     </w:p>
     <w:p>
       <w:pPr>
-        <w:pStyle w:val="NoSpacing"/>
+        <w:spacing w:before="0" w:after="120"/>
+        <w:jc w:val="left"/>
+      </w:pPr>
+      <w:r>
+        <w:rPr>
+          <w:rFonts w:ascii="Calibri" w:hAnsi="Calibri"/>
+          <w:b w:val="0"/>
+          <w:i w:val="0"/>
+          <w:color w:val="424242"/>
+          <w:sz w:val="21"/>
+        </w:rPr>
+        <w:t>Para mostrar los datos se utilizó la directiva v-for, que itera el arreglo chuck y genera un componente por cada elemento. La clave :key se asigna al índice para que Vue pueda rastrear cada nodo de manera eficiente.</w:t>
+      </w:r>
+    </w:p>
+    <w:p>
+      <w:pPr>
+        <w:spacing w:after="120"/>
+        <w:ind w:left="432"/>
+        <w:shd w:val="clear" w:color="auto" w:fill="F5F5F5"/>
       </w:pPr>
       <w:r>
         <w:rPr>
           <w:rFonts w:ascii="Courier New" w:hAnsi="Courier New"/>
-          <w:color w:val="505050"/>
+          <w:color w:val="3C3C3C"/>
           <w:sz w:val="18"/>
         </w:rPr>
-        <w:t>&lt;li v-for="(joke, index) in chuck" :key="index"&gt;{{ joke.value }}&lt;/li&gt;</w:t>
+        <w:t>&lt;chuck-card</w:t>
+        <w:br/>
+        <w:t xml:space="preserve">  v-for="(joke, index) in chuck"</w:t>
+        <w:br/>
+        <w:t xml:space="preserve">  :key="index"</w:t>
+        <w:br/>
+        <w:t xml:space="preserve">  :value="joke.value"</w:t>
+        <w:br/>
+        <w:t>&gt;&lt;/chuck-card&gt;</w:t>
       </w:r>
     </w:p>
     <w:p>
       <w:pPr>
-        <w:pStyle w:val="Heading1"/>
+        <w:spacing w:before="200" w:after="60"/>
+        <w:jc w:val="left"/>
       </w:pPr>
       <w:r>
-        <w:t>Screenshots</w:t>
-      </w:r>
-    </w:p>
-    <w:p>
-      <w:r>
-        <w:t>The following screenshots show the running application in the local preview server (localhost:5500). The dark theme is applied with a gradient header, rounded cards, and hover animations.</w:t>
-      </w:r>
-    </w:p>
-    <w:p>
-      <w:r>
-        <w:t>[Screenshot 1 – Desktop view: Header with title "CHUCK NORRIS JOKES" and dark gradient background with tagline]</w:t>
-      </w:r>
-    </w:p>
-    <w:p>
-      <w:r>
-        <w:t>[Screenshot 2 – Mobile view: Single-column card layout at 375px width]</w:t>
-      </w:r>
-    </w:p>
-    <w:p>
-      <w:r>
-        <w:t>Note: Images from the chucknorris.host CDN do not load inside the sandboxed preview environment but load correctly when opened in a standard browser.</w:t>
+        <w:rPr>
+          <w:rFonts w:ascii="Calibri" w:hAnsi="Calibri"/>
+          <w:b/>
+          <w:i w:val="0"/>
+          <w:color w:val="00897B"/>
+          <w:sz w:val="24"/>
+        </w:rPr>
+        <w:t>Hoja de estilos</w:t>
       </w:r>
     </w:p>
     <w:p>
       <w:pPr>
+        <w:spacing w:before="0" w:after="120"/>
+        <w:jc w:val="left"/>
+      </w:pPr>
+      <w:r>
+        <w:rPr>
+          <w:rFonts w:ascii="Calibri" w:hAnsi="Calibri"/>
+          <w:b w:val="0"/>
+          <w:i w:val="0"/>
+          <w:color w:val="424242"/>
+          <w:sz w:val="21"/>
+        </w:rPr>
+        <w:t>Se añadió una hoja de estilos personalizada (css/style.css) con un tema oscuro: fondo degradado en el header, tarjetas con bordes redondeados y animaciones de hover. El objetivo era darle al proyecto una apariencia minimalista y atractiva, alejada del estilo por defecto de un navegador.</w:t>
+      </w:r>
+    </w:p>
+    <w:p>
+      <w:pPr>
+        <w:spacing w:before="200" w:after="60"/>
+        <w:jc w:val="left"/>
+      </w:pPr>
+      <w:r>
+        <w:rPr>
+          <w:rFonts w:ascii="Calibri" w:hAnsi="Calibri"/>
+          <w:b/>
+          <w:i w:val="0"/>
+          <w:color w:val="00897B"/>
+          <w:sz w:val="24"/>
+        </w:rPr>
+        <w:t>Vista de la aplicación</w:t>
+      </w:r>
+    </w:p>
+    <w:p>
+      <w:pPr>
+        <w:spacing w:before="0" w:after="160"/>
+        <w:jc w:val="center"/>
+      </w:pPr>
+      <w:r>
+        <w:rPr>
+          <w:rFonts w:ascii="Calibri" w:hAnsi="Calibri"/>
+          <w:b w:val="0"/>
+          <w:i/>
+          <w:color w:val="646464"/>
+          <w:sz w:val="19"/>
+        </w:rPr>
+        <w:t>Fig. 1 — Vista de escritorio: header con título 'CHUCK NORRIS JOKES', tema oscuro y tarjetas con los chistes</w:t>
+      </w:r>
+    </w:p>
+    <w:p>
+      <w:pPr>
+        <w:spacing w:before="0" w:after="80"/>
+        <w:jc w:val="left"/>
+      </w:pPr>
+    </w:p>
+    <w:p>
+      <w:pPr>
+        <w:spacing w:before="0" w:after="160"/>
+        <w:jc w:val="center"/>
+      </w:pPr>
+      <w:r>
+        <w:rPr>
+          <w:rFonts w:ascii="Calibri" w:hAnsi="Calibri"/>
+          <w:b w:val="0"/>
+          <w:i/>
+          <w:color w:val="646464"/>
+          <w:sz w:val="19"/>
+        </w:rPr>
+        <w:t>Fig. 2 — Vista móvil (375 px): diseño de una columna, cada tarjeta ocupa el ancho completo</w:t>
+      </w:r>
+    </w:p>
+    <w:p>
+      <w:pPr>
+        <w:spacing w:before="280" w:after="80"/>
+        <w:jc w:val="left"/>
         <w:pBdr>
-          <w:bottom w:val="single" w:sz="6" w:space="1" w:color="C0392B"/>
+          <w:bottom w:val="single" w:sz="4" w:space="1" w:color="1A237E"/>
+        </w:pBdr>
+      </w:pPr>
+      <w:r>
+        <w:rPr>
+          <w:rFonts w:ascii="Calibri" w:hAnsi="Calibri"/>
+          <w:b/>
+          <w:i w:val="0"/>
+          <w:color w:val="1A237E"/>
+          <w:sz w:val="30"/>
+        </w:rPr>
+        <w:t>Aprendizaje y reflexión</w:t>
+      </w:r>
+    </w:p>
+    <w:p>
+      <w:pPr>
+        <w:spacing w:before="0" w:after="120"/>
+        <w:jc w:val="left"/>
+      </w:pPr>
+      <w:r>
+        <w:rPr>
+          <w:rFonts w:ascii="Calibri" w:hAnsi="Calibri"/>
+          <w:b w:val="0"/>
+          <w:i w:val="0"/>
+          <w:color w:val="424242"/>
+          <w:sz w:val="21"/>
+        </w:rPr>
+        <w:t>Lo que más me costó al principio fue entender cómo Vue conecta los datos con el template sin necesidad de getElementById ni innerHTML. Una vez que vi que la directiva v-for simplemente recorre el arreglo y genera el HTML automáticamente, todo encajó.</w:t>
+      </w:r>
+    </w:p>
+    <w:p>
+      <w:pPr>
+        <w:spacing w:before="0" w:after="120"/>
+        <w:jc w:val="left"/>
+      </w:pPr>
+      <w:r>
+        <w:rPr>
+          <w:rFonts w:ascii="Calibri" w:hAnsi="Calibri"/>
+          <w:b w:val="0"/>
+          <w:i w:val="0"/>
+          <w:color w:val="424242"/>
+          <w:sz w:val="21"/>
+        </w:rPr>
+        <w:t>Lo más valioso que me llevo de esta actividad es el concepto de reactividad: el template siempre refleja el estado actual de los datos. Si mañana quisiera agregar un chiste más al arreglo, solo añado un objeto y Vue lo muestra sin tocar el HTML.</w:t>
+      </w:r>
+    </w:p>
+    <w:p>
+      <w:pPr>
+        <w:spacing w:before="0" w:after="160"/>
+        <w:jc w:val="left"/>
+      </w:pPr>
+      <w:r>
+        <w:rPr>
+          <w:rFonts w:ascii="Calibri" w:hAnsi="Calibri"/>
+          <w:b w:val="0"/>
+          <w:i/>
+          <w:color w:val="00897B"/>
+          <w:sz w:val="21"/>
+        </w:rPr>
+        <w:t>💡 Vue no es solo una librería de vistas; es una forma diferente de pensar la relación entre datos y UI.</w:t>
+      </w:r>
+    </w:p>
+    <w:p>
+      <w:pPr>
+        <w:spacing w:before="80" w:after="80"/>
+        <w:pBdr>
+          <w:bottom w:val="single" w:sz="6" w:space="1" w:color="1A237E"/>
         </w:pBdr>
       </w:pPr>
     </w:p>
     <w:p>
       <w:pPr>
-        <w:pStyle w:val="Heading1"/>
+        <w:spacing w:before="280" w:after="80"/>
+        <w:jc w:val="left"/>
+        <w:pBdr>
+          <w:bottom w:val="single" w:sz="4" w:space="1" w:color="1A237E"/>
+        </w:pBdr>
       </w:pPr>
       <w:r>
-        <w:t>GitHub Repository</w:t>
+        <w:rPr>
+          <w:rFonts w:ascii="Calibri" w:hAnsi="Calibri"/>
+          <w:b/>
+          <w:i w:val="0"/>
+          <w:color w:val="1A237E"/>
+          <w:sz w:val="30"/>
+        </w:rPr>
+        <w:t>URL del repositorio en GitHub</w:t>
       </w:r>
     </w:p>
     <w:p>
-      <w:r>
-        <w:t xml:space="preserve">URL: </w:t>
-      </w:r>
+      <w:pPr>
+        <w:spacing w:after="80"/>
+      </w:pPr>
       <w:r>
         <w:rPr>
-          <w:color w:val="0000FF"/>
-          <w:u w:val="single"/>
+          <w:rFonts w:ascii="Calibri" w:hAnsi="Calibri"/>
+          <w:b/>
+          <w:i w:val="0"/>
+          <w:color w:val="424242"/>
+          <w:sz w:val="21"/>
         </w:rPr>
-        <w:t>https://github.com/nox-sudo/ChuckJokesVue</w:t>
+        <w:t xml:space="preserve">Repositorio: </w:t>
       </w:r>
+      <w:hyperlink r:id="rId9">
+        <w:r>
+          <w:rPr>
+            <w:rStyle w:val="Hyperlink"/>
+          </w:rPr>
+          <w:t>https://github.com/nox-sudo/ChuckJokesVue</w:t>
+        </w:r>
+      </w:hyperlink>
     </w:p>
     <w:sectPr>
       <w:pgSz w:w="12240" w:h="15840"/>
-      <w:pgMar w:top="1440" w:right="1800" w:bottom="1440" w:left="1800" w:header="720" w:footer="720" w:gutter="0"/>
+      <w:pgMar w:top="1440" w:right="1728" w:bottom="1440" w:left="1728" w:header="720" w:footer="720" w:gutter="0"/>
       <w:cols w:space="720"/>
       <w:docGrid w:linePitch="360"/>
     </w:sectPr>

</xml_diff>

<commit_message>
Embed desktop and mobile screenshots into both reports
</commit_message>
<xml_diff>
--- a/Reporte_Activity12.docx
+++ b/Reporte_Activity12.docx
@@ -210,7 +210,7 @@
           <w:color w:val="424242"/>
           <w:sz w:val="21"/>
         </w:rPr>
-        <w:t>Lo que me resultó interesante de Vue desde el principio es que separa muy claramente los datos de la presentación. No hay que manipular el DOM directamente; simplemente declaras qué datos quieres mostrar y Vue se encarga de renderizarlos y mantenerlos actualizados automáticamente.</w:t>
+        <w:t>Lo que me resultó interesante de Vue desde el principio es que separa muy claramente los datos de la presentación. No hay que manipular el DOM directamente; simplemente declaras qué datos quieres mostrar y Vue se encarga de renderizarlos automáticamente.</w:t>
       </w:r>
     </w:p>
     <w:p>
@@ -282,8 +282,6 @@
         <w:br/>
         <w:t xml:space="preserve">  { "value": "The chief export of Chuck Norris is pain." },</w:t>
         <w:br/>
-        <w:t xml:space="preserve">  { "value": "Chuck Norris doesn't read books..." },</w:t>
-        <w:br/>
         <w:t xml:space="preserve">  { "value": "Time waits for no man. Unless that man is Chuck Norris." },</w:t>
         <w:br/>
         <w:t xml:space="preserve">  { "value": "If you spell Chuck Norris in Scrabble, you win. Forever." }</w:t>
@@ -320,7 +318,7 @@
           <w:color w:val="424242"/>
           <w:sz w:val="21"/>
         </w:rPr>
-        <w:t>Para mostrar los datos se utilizó la directiva v-for, que itera el arreglo chuck y genera un componente por cada elemento. La clave :key se asigna al índice para que Vue pueda rastrear cada nodo de manera eficiente.</w:t>
+        <w:t>Para mostrar los datos se utilizó la directiva v-for, que itera el arreglo chuck y genera un componente por cada elemento.</w:t>
       </w:r>
     </w:p>
     <w:p>
@@ -375,23 +373,66 @@
           <w:color w:val="424242"/>
           <w:sz w:val="21"/>
         </w:rPr>
-        <w:t>Se añadió una hoja de estilos personalizada (css/style.css) con un tema oscuro: fondo degradado en el header, tarjetas con bordes redondeados y animaciones de hover. El objetivo era darle al proyecto una apariencia minimalista y atractiva, alejada del estilo por defecto de un navegador.</w:t>
+        <w:t>Se añadió una hoja de estilos personalizada (css/style.css) con un tema oscuro: fondo degradado en el header, tarjetas con bordes redondeados y animaciones de hover.</w:t>
       </w:r>
     </w:p>
     <w:p>
       <w:pPr>
-        <w:spacing w:before="200" w:after="60"/>
+        <w:spacing w:before="280" w:after="80"/>
         <w:jc w:val="left"/>
+        <w:pBdr>
+          <w:bottom w:val="single" w:sz="4" w:space="1" w:color="1A237E"/>
+        </w:pBdr>
       </w:pPr>
       <w:r>
         <w:rPr>
           <w:rFonts w:ascii="Calibri" w:hAnsi="Calibri"/>
           <w:b/>
           <w:i w:val="0"/>
-          <w:color w:val="00897B"/>
-          <w:sz w:val="24"/>
+          <w:color w:val="1A237E"/>
+          <w:sz w:val="30"/>
         </w:rPr>
-        <w:t>Vista de la aplicación</w:t>
+        <w:t>Capturas de pantalla</w:t>
+      </w:r>
+    </w:p>
+    <w:p>
+      <w:pPr>
+        <w:spacing w:before="120" w:after="80"/>
+        <w:jc w:val="center"/>
+      </w:pPr>
+      <w:r>
+        <w:drawing>
+          <wp:inline xmlns:a="http://schemas.openxmlformats.org/drawingml/2006/main" xmlns:pic="http://schemas.openxmlformats.org/drawingml/2006/picture">
+            <wp:extent cx="5029200" cy="3728680"/>
+            <wp:docPr id="1" name="Picture 1"/>
+            <wp:cNvGraphicFramePr>
+              <a:graphicFrameLocks noChangeAspect="1"/>
+            </wp:cNvGraphicFramePr>
+            <a:graphic>
+              <a:graphicData uri="http://schemas.openxmlformats.org/drawingml/2006/picture">
+                <pic:pic>
+                  <pic:nvPicPr>
+                    <pic:cNvPr id="0" name="screenshot_desktop.png"/>
+                    <pic:cNvPicPr/>
+                  </pic:nvPicPr>
+                  <pic:blipFill>
+                    <a:blip r:embed="rId9"/>
+                    <a:stretch>
+                      <a:fillRect/>
+                    </a:stretch>
+                  </pic:blipFill>
+                  <pic:spPr>
+                    <a:xfrm>
+                      <a:off x="0" y="0"/>
+                      <a:ext cx="5029200" cy="3728680"/>
+                    </a:xfrm>
+                    <a:prstGeom prst="rect"/>
+                  </pic:spPr>
+                </pic:pic>
+              </a:graphicData>
+            </a:graphic>
+          </wp:inline>
+        </w:drawing>
       </w:r>
     </w:p>
     <w:p>
@@ -407,14 +448,48 @@
           <w:color w:val="646464"/>
           <w:sz w:val="19"/>
         </w:rPr>
-        <w:t>Fig. 1 — Vista de escritorio: header con título 'CHUCK NORRIS JOKES', tema oscuro y tarjetas con los chistes</w:t>
+        <w:t>Fig. 1 — Vista escritorio (1280 px): header degradado, 3 tarjetas en la primera fila y 2 en la segunda</w:t>
       </w:r>
     </w:p>
     <w:p>
       <w:pPr>
-        <w:spacing w:before="0" w:after="80"/>
-        <w:jc w:val="left"/>
+        <w:spacing w:before="120" w:after="80"/>
+        <w:jc w:val="center"/>
       </w:pPr>
+      <w:r>
+        <w:drawing>
+          <wp:inline xmlns:a="http://schemas.openxmlformats.org/drawingml/2006/main" xmlns:pic="http://schemas.openxmlformats.org/drawingml/2006/picture">
+            <wp:extent cx="2011680" cy="9795540"/>
+            <wp:docPr id="2" name="Picture 2"/>
+            <wp:cNvGraphicFramePr>
+              <a:graphicFrameLocks noChangeAspect="1"/>
+            </wp:cNvGraphicFramePr>
+            <a:graphic>
+              <a:graphicData uri="http://schemas.openxmlformats.org/drawingml/2006/picture">
+                <pic:pic>
+                  <pic:nvPicPr>
+                    <pic:cNvPr id="0" name="screenshot_mobile.png"/>
+                    <pic:cNvPicPr/>
+                  </pic:nvPicPr>
+                  <pic:blipFill>
+                    <a:blip r:embed="rId10"/>
+                    <a:stretch>
+                      <a:fillRect/>
+                    </a:stretch>
+                  </pic:blipFill>
+                  <pic:spPr>
+                    <a:xfrm>
+                      <a:off x="0" y="0"/>
+                      <a:ext cx="2011680" cy="9795540"/>
+                    </a:xfrm>
+                    <a:prstGeom prst="rect"/>
+                  </pic:spPr>
+                </pic:pic>
+              </a:graphicData>
+            </a:graphic>
+          </wp:inline>
+        </w:drawing>
+      </w:r>
     </w:p>
     <w:p>
       <w:pPr>
@@ -464,23 +539,7 @@
           <w:color w:val="424242"/>
           <w:sz w:val="21"/>
         </w:rPr>
-        <w:t>Lo que más me costó al principio fue entender cómo Vue conecta los datos con el template sin necesidad de getElementById ni innerHTML. Una vez que vi que la directiva v-for simplemente recorre el arreglo y genera el HTML automáticamente, todo encajó.</w:t>
-      </w:r>
-    </w:p>
-    <w:p>
-      <w:pPr>
-        <w:spacing w:before="0" w:after="120"/>
-        <w:jc w:val="left"/>
-      </w:pPr>
-      <w:r>
-        <w:rPr>
-          <w:rFonts w:ascii="Calibri" w:hAnsi="Calibri"/>
-          <w:b w:val="0"/>
-          <w:i w:val="0"/>
-          <w:color w:val="424242"/>
-          <w:sz w:val="21"/>
-        </w:rPr>
-        <w:t>Lo más valioso que me llevo de esta actividad es el concepto de reactividad: el template siempre refleja el estado actual de los datos. Si mañana quisiera agregar un chiste más al arreglo, solo añado un objeto y Vue lo muestra sin tocar el HTML.</w:t>
+        <w:t>Lo más valioso que me llevo es el concepto de reactividad: el template siempre refleja el estado actual de los datos. Si mañana quisiera agregar un chiste más al arreglo, solo añado un objeto y Vue lo muestra sin tocar el HTML.</w:t>
       </w:r>
     </w:p>
     <w:p>
@@ -540,7 +599,7 @@
         </w:rPr>
         <w:t xml:space="preserve">Repositorio: </w:t>
       </w:r>
-      <w:hyperlink r:id="rId9">
+      <w:hyperlink r:id="rId11">
         <w:r>
           <w:rPr>
             <w:rStyle w:val="Hyperlink"/>

</xml_diff>

<commit_message>
Add real screenshots with images to both reports
</commit_message>
<xml_diff>
--- a/Reporte_Activity12.docx
+++ b/Reporte_Activity12.docx
@@ -194,7 +194,7 @@
           <w:color w:val="424242"/>
           <w:sz w:val="21"/>
         </w:rPr>
-        <w:t>La actividad consistía en crear una aplicación web con el framework Vue.js que desplegara una lista de frases célebres de Chuck Norris. La idea central era aprender el funcionamiento básico de Vue: cómo se declara una instancia, cómo se almacenan datos reactivos y cómo se itera sobre ellos en el template usando la directiva v-for.</w:t>
+        <w:t>La actividad consistía en crear una aplicación web con Vue.js que desplegara una lista de frases célebres de Chuck Norris. La idea central era aprender el funcionamiento básico de Vue: cómo se declara una instancia, cómo se almacenan datos reactivos y cómo se itera sobre ellos usando la directiva v-for.</w:t>
       </w:r>
     </w:p>
     <w:p>
@@ -210,7 +210,7 @@
           <w:color w:val="424242"/>
           <w:sz w:val="21"/>
         </w:rPr>
-        <w:t>Lo que me resultó interesante de Vue desde el principio es que separa muy claramente los datos de la presentación. No hay que manipular el DOM directamente; simplemente declaras qué datos quieres mostrar y Vue se encarga de renderizarlos automáticamente.</w:t>
+        <w:t>Lo que me resultó interesante de Vue es que separa claramente los datos de la presentación. No hay que manipular el DOM directamente; declaras qué datos quieres mostrar y Vue se encarga de renderizarlos automáticamente.</w:t>
       </w:r>
     </w:p>
     <w:p>
@@ -318,7 +318,7 @@
           <w:color w:val="424242"/>
           <w:sz w:val="21"/>
         </w:rPr>
-        <w:t>Para mostrar los datos se utilizó la directiva v-for, que itera el arreglo chuck y genera un componente por cada elemento.</w:t>
+        <w:t>Para mostrar los datos se utilizó la directiva v-for, que itera el arreglo chuck y genera un componente por cada elemento. La clave :key se asigna al índice.</w:t>
       </w:r>
     </w:p>
     <w:p>
@@ -373,7 +373,7 @@
           <w:color w:val="424242"/>
           <w:sz w:val="21"/>
         </w:rPr>
-        <w:t>Se añadió una hoja de estilos personalizada (css/style.css) con un tema oscuro: fondo degradado en el header, tarjetas con bordes redondeados y animaciones de hover.</w:t>
+        <w:t>Se añadió css/style.css con un tema oscuro: fondo degradado en el header, tarjetas con bordes redondeados y animaciones de hover que elevan la tarjeta al pasar el cursor.</w:t>
       </w:r>
     </w:p>
     <w:p>
@@ -437,7 +437,7 @@
     </w:p>
     <w:p>
       <w:pPr>
-        <w:spacing w:before="0" w:after="160"/>
+        <w:spacing w:after="200"/>
         <w:jc w:val="center"/>
       </w:pPr>
       <w:r>
@@ -448,7 +448,7 @@
           <w:color w:val="646464"/>
           <w:sz w:val="19"/>
         </w:rPr>
-        <w:t>Fig. 1 — Vista escritorio (1280 px): header degradado, 3 tarjetas en la primera fila y 2 en la segunda</w:t>
+        <w:t>Fig. 1 — Vista escritorio (1280 px): 3 tarjetas en primera fila, 2 en segunda, con imagen y texto</w:t>
       </w:r>
     </w:p>
     <w:p>
@@ -493,7 +493,7 @@
     </w:p>
     <w:p>
       <w:pPr>
-        <w:spacing w:before="0" w:after="160"/>
+        <w:spacing w:after="200"/>
         <w:jc w:val="center"/>
       </w:pPr>
       <w:r>
@@ -504,7 +504,7 @@
           <w:color w:val="646464"/>
           <w:sz w:val="19"/>
         </w:rPr>
-        <w:t>Fig. 2 — Vista móvil (375 px): diseño de una columna, cada tarjeta ocupa el ancho completo</w:t>
+        <w:t>Fig. 2 — Vista móvil (375 px): 1 tarjeta por fila, diseño completamente responsive</w:t>
       </w:r>
     </w:p>
     <w:p>

</xml_diff>